<commit_message>
DATA_MODEL: sync to trimmed schema (drop unused columns + view)
Removed the dropped columns from every table's field list (residents
age/suffix/educational_attainment/philhealth_no, households water_source/
electricity, qr_verifications officer_id, incidents respondent/
resolved_date, survey_responses other_need, population_history extras),
removed the residents_with_age view, added needs-photos bucket + survey
photo_url, fixed incidents.officer_id->profiles, 2-role note, and the
data-flow map. Added a trim note. Regenerated .docx.
</commit_message>
<xml_diff>
--- a/docx/DATA_MODEL.docx
+++ b/docx/DATA_MODEL.docx
@@ -30,7 +30,6 @@
       <w:r>
         <w:rPr>
           <w:rFonts w:ascii="Consolas" w:hAnsi="Consolas"/>
-          <w:color w:val="B03060"/>
           <w:sz w:val="20"/>
         </w:rPr>
         <w:t>DATABASE_SETUP.sql</w:t>
@@ -46,7 +45,6 @@
       <w:r>
         <w:rPr>
           <w:rFonts w:ascii="Consolas" w:hAnsi="Consolas"/>
-          <w:color w:val="B03060"/>
           <w:sz w:val="20"/>
         </w:rPr>
         <w:t>DATABASE_SETUP.sql</w:t>
@@ -232,7 +230,6 @@
             <w:r>
               <w:rPr>
                 <w:rFonts w:ascii="Consolas" w:hAnsi="Consolas"/>
-                <w:color w:val="B03060"/>
                 <w:sz w:val="20"/>
               </w:rPr>
               <w:t>DATABASE_SETUP.sql</w:t>
@@ -246,44 +243,32 @@
           <w:p>
             <w:r/>
             <w:r>
-              <w:t xml:space="preserve">residents, households, incidents, profiles, beneficiaries, assistance_programs, qr_verifications, survey_responses, the </w:t>
-            </w:r>
+              <w:t>residents, households, incidents, profiles, beneficiaries, assistance_programs, qr_verifications, survey_responses</w:t>
+            </w:r>
+          </w:p>
+        </w:tc>
+      </w:tr>
+      <w:tr>
+        <w:tc>
+          <w:tcPr>
+            <w:tcW w:type="dxa" w:w="2880"/>
+          </w:tcPr>
+          <w:p>
+            <w:r/>
+            <w:r>
+              <w:t>Migrations (all-in-one)</w:t>
+            </w:r>
+          </w:p>
+        </w:tc>
+        <w:tc>
+          <w:tcPr>
+            <w:tcW w:type="dxa" w:w="2880"/>
+          </w:tcPr>
+          <w:p>
+            <w:r/>
             <w:r>
               <w:rPr>
                 <w:rFonts w:ascii="Consolas" w:hAnsi="Consolas"/>
-                <w:color w:val="B03060"/>
-                <w:sz w:val="20"/>
-              </w:rPr>
-              <w:t>residents_with_age</w:t>
-            </w:r>
-            <w:r>
-              <w:t xml:space="preserve"> view</w:t>
-            </w:r>
-          </w:p>
-        </w:tc>
-      </w:tr>
-      <w:tr>
-        <w:tc>
-          <w:tcPr>
-            <w:tcW w:type="dxa" w:w="2880"/>
-          </w:tcPr>
-          <w:p>
-            <w:r/>
-            <w:r>
-              <w:t>Migrations (all-in-one)</w:t>
-            </w:r>
-          </w:p>
-        </w:tc>
-        <w:tc>
-          <w:tcPr>
-            <w:tcW w:type="dxa" w:w="2880"/>
-          </w:tcPr>
-          <w:p>
-            <w:r/>
-            <w:r>
-              <w:rPr>
-                <w:rFonts w:ascii="Consolas" w:hAnsi="Consolas"/>
-                <w:color w:val="B03060"/>
                 <w:sz w:val="20"/>
               </w:rPr>
               <w:t>DATABASE_SETUP.sql</w:t>
@@ -297,12 +282,11 @@
           <w:p>
             <w:r/>
             <w:r>
-              <w:t xml:space="preserve">6-role profiles, Batanes crime types, </w:t>
+              <w:t xml:space="preserve">2-role profiles (brgy_sec / tanod), Batanes crime types, </w:t>
             </w:r>
             <w:r>
               <w:rPr>
                 <w:rFonts w:ascii="Consolas" w:hAnsi="Consolas"/>
-                <w:color w:val="B03060"/>
                 <w:sz w:val="20"/>
               </w:rPr>
               <w:t>is_out_of_school_youth</w:t>
@@ -313,7 +297,6 @@
             <w:r>
               <w:rPr>
                 <w:rFonts w:ascii="Consolas" w:hAnsi="Consolas"/>
-                <w:color w:val="B03060"/>
                 <w:sz w:val="20"/>
               </w:rPr>
               <w:t>announcements</w:t>
@@ -324,7 +307,6 @@
             <w:r>
               <w:rPr>
                 <w:rFonts w:ascii="Consolas" w:hAnsi="Consolas"/>
-                <w:color w:val="B03060"/>
                 <w:sz w:val="20"/>
               </w:rPr>
               <w:t>audit_logs</w:t>
@@ -335,7 +317,6 @@
             <w:r>
               <w:rPr>
                 <w:rFonts w:ascii="Consolas" w:hAnsi="Consolas"/>
-                <w:color w:val="B03060"/>
                 <w:sz w:val="20"/>
               </w:rPr>
               <w:t>population_history</w:t>
@@ -346,10 +327,48 @@
             <w:r>
               <w:rPr>
                 <w:rFonts w:ascii="Consolas" w:hAnsi="Consolas"/>
-                <w:color w:val="B03060"/>
                 <w:sz w:val="20"/>
               </w:rPr>
               <w:t>disaster_risk_zones</w:t>
+            </w:r>
+          </w:p>
+        </w:tc>
+      </w:tr>
+      <w:tr>
+        <w:tc>
+          <w:tcPr>
+            <w:tcW w:type="dxa" w:w="2880"/>
+          </w:tcPr>
+          <w:p>
+            <w:r/>
+            <w:r>
+              <w:t>Column trim</w:t>
+            </w:r>
+          </w:p>
+        </w:tc>
+        <w:tc>
+          <w:tcPr>
+            <w:tcW w:type="dxa" w:w="2880"/>
+          </w:tcPr>
+          <w:p>
+            <w:r/>
+            <w:r>
+              <w:rPr>
+                <w:rFonts w:ascii="Consolas" w:hAnsi="Consolas"/>
+                <w:sz w:val="20"/>
+              </w:rPr>
+              <w:t>trim_unused_columns.sql</w:t>
+            </w:r>
+          </w:p>
+        </w:tc>
+        <w:tc>
+          <w:tcPr>
+            <w:tcW w:type="dxa" w:w="2880"/>
+          </w:tcPr>
+          <w:p>
+            <w:r/>
+            <w:r>
+              <w:t>drops columns the app never uses (see note below) so the DB matches the system</w:t>
             </w:r>
           </w:p>
         </w:tc>
@@ -361,7 +380,181 @@
         <w:rPr>
           <w:b/>
         </w:rPr>
-        <w:t>To make Supabase match the system: run `DATABASE_SETUP.sql` once.</w:t>
+        <w:t>To make Supabase match the system: run `DATABASE_SETUP.sql`, then `trim_unused_columns.sql`, once.</w:t>
+      </w:r>
+    </w:p>
+    <w:p>
+      <w:pPr>
+        <w:ind w:left="360"/>
+      </w:pPr>
+      <w:r>
+        <w:rPr>
+          <w:b/>
+          <w:i/>
+        </w:rPr>
+        <w:t>Note:</w:t>
+      </w:r>
+      <w:r>
+        <w:rPr>
+          <w:i/>
+        </w:rPr>
+        <w:t xml:space="preserve"> This reference reflects the </w:t>
+      </w:r>
+      <w:r>
+        <w:rPr>
+          <w:b/>
+          <w:i/>
+        </w:rPr>
+        <w:t>trimmed</w:t>
+      </w:r>
+      <w:r>
+        <w:rPr>
+          <w:i/>
+        </w:rPr>
+        <w:t xml:space="preserve"> schema (after </w:t>
+      </w:r>
+      <w:r>
+        <w:rPr>
+          <w:rFonts w:ascii="Consolas" w:hAnsi="Consolas"/>
+          <w:i/>
+          <w:sz w:val="20"/>
+        </w:rPr>
+        <w:t>trim_unused_columns.sql</w:t>
+      </w:r>
+      <w:r>
+        <w:rPr>
+          <w:i/>
+        </w:rPr>
+        <w:t>). The</w:t>
+      </w:r>
+    </w:p>
+    <w:p>
+      <w:pPr>
+        <w:ind w:left="360"/>
+      </w:pPr>
+      <w:r>
+        <w:rPr>
+          <w:i/>
+        </w:rPr>
+        <w:t xml:space="preserve">following columns were removed as unused: </w:t>
+      </w:r>
+      <w:r>
+        <w:rPr>
+          <w:rFonts w:ascii="Consolas" w:hAnsi="Consolas"/>
+          <w:i/>
+          <w:sz w:val="20"/>
+        </w:rPr>
+        <w:t>residents.age/suffix/educational_attainment/philhealth_no</w:t>
+      </w:r>
+      <w:r>
+        <w:rPr>
+          <w:i/>
+        </w:rPr>
+        <w:t>,</w:t>
+      </w:r>
+    </w:p>
+    <w:p>
+      <w:pPr>
+        <w:ind w:left="360"/>
+      </w:pPr>
+      <w:r>
+        <w:rPr>
+          <w:rFonts w:ascii="Consolas" w:hAnsi="Consolas"/>
+          <w:i/>
+          <w:sz w:val="20"/>
+        </w:rPr>
+        <w:t>households.water_source/electricity</w:t>
+      </w:r>
+      <w:r>
+        <w:rPr>
+          <w:i/>
+        </w:rPr>
+        <w:t xml:space="preserve">, </w:t>
+      </w:r>
+      <w:r>
+        <w:rPr>
+          <w:rFonts w:ascii="Consolas" w:hAnsi="Consolas"/>
+          <w:i/>
+          <w:sz w:val="20"/>
+        </w:rPr>
+        <w:t>qr_verifications.officer_id</w:t>
+      </w:r>
+      <w:r>
+        <w:rPr>
+          <w:i/>
+        </w:rPr>
+        <w:t>,</w:t>
+      </w:r>
+    </w:p>
+    <w:p>
+      <w:pPr>
+        <w:ind w:left="360"/>
+      </w:pPr>
+      <w:r>
+        <w:rPr>
+          <w:rFonts w:ascii="Consolas" w:hAnsi="Consolas"/>
+          <w:i/>
+          <w:sz w:val="20"/>
+        </w:rPr>
+        <w:t>incidents.respondent/resolved_date</w:t>
+      </w:r>
+      <w:r>
+        <w:rPr>
+          <w:i/>
+        </w:rPr>
+        <w:t xml:space="preserve">, </w:t>
+      </w:r>
+      <w:r>
+        <w:rPr>
+          <w:rFonts w:ascii="Consolas" w:hAnsi="Consolas"/>
+          <w:i/>
+          <w:sz w:val="20"/>
+        </w:rPr>
+        <w:t>survey_responses.other_need</w:t>
+      </w:r>
+      <w:r>
+        <w:rPr>
+          <w:i/>
+        </w:rPr>
+        <w:t>,</w:t>
+      </w:r>
+    </w:p>
+    <w:p>
+      <w:pPr>
+        <w:ind w:left="360"/>
+      </w:pPr>
+      <w:r>
+        <w:rPr>
+          <w:rFonts w:ascii="Consolas" w:hAnsi="Consolas"/>
+          <w:i/>
+          <w:sz w:val="20"/>
+        </w:rPr>
+        <w:t>population_history</w:t>
+      </w:r>
+      <w:r>
+        <w:rPr>
+          <w:i/>
+        </w:rPr>
+        <w:t xml:space="preserve"> male/female/household/birth/death/migration/source, and the</w:t>
+      </w:r>
+    </w:p>
+    <w:p>
+      <w:pPr>
+        <w:ind w:left="360"/>
+      </w:pPr>
+      <w:r>
+        <w:rPr>
+          <w:rFonts w:ascii="Consolas" w:hAnsi="Consolas"/>
+          <w:i/>
+          <w:sz w:val="20"/>
+        </w:rPr>
+        <w:t>residents_with_age</w:t>
+      </w:r>
+      <w:r>
+        <w:rPr>
+          <w:i/>
+        </w:rPr>
+        <w:t xml:space="preserve"> view.</w:t>
       </w:r>
     </w:p>
     <w:p>
@@ -401,7 +594,6 @@
       <w:r>
         <w:rPr>
           <w:rFonts w:ascii="Consolas" w:hAnsi="Consolas"/>
-          <w:color w:val="B03060"/>
           <w:sz w:val="20"/>
         </w:rPr>
         <w:t>profiles</w:t>
@@ -495,7 +687,6 @@
             <w:r>
               <w:rPr>
                 <w:rFonts w:ascii="Consolas" w:hAnsi="Consolas"/>
-                <w:color w:val="B03060"/>
                 <w:sz w:val="20"/>
               </w:rPr>
               <w:t>id</w:t>
@@ -525,7 +716,6 @@
             <w:r>
               <w:rPr>
                 <w:rFonts w:ascii="Consolas" w:hAnsi="Consolas"/>
-                <w:color w:val="B03060"/>
                 <w:sz w:val="20"/>
               </w:rPr>
               <w:t>auth.users.id</w:t>
@@ -581,7 +771,6 @@
             <w:r>
               <w:rPr>
                 <w:rFonts w:ascii="Consolas" w:hAnsi="Consolas"/>
-                <w:color w:val="B03060"/>
                 <w:sz w:val="20"/>
               </w:rPr>
               <w:t>role</w:t>
@@ -608,7 +797,6 @@
             <w:r>
               <w:rPr>
                 <w:rFonts w:ascii="Consolas" w:hAnsi="Consolas"/>
-                <w:color w:val="B03060"/>
                 <w:sz w:val="20"/>
               </w:rPr>
               <w:t>brgy_sec</w:t>
@@ -619,7 +807,6 @@
             <w:r>
               <w:rPr>
                 <w:rFonts w:ascii="Consolas" w:hAnsi="Consolas"/>
-                <w:color w:val="B03060"/>
                 <w:sz w:val="20"/>
               </w:rPr>
               <w:t>tanod</w:t>
@@ -675,7 +862,6 @@
             <w:r>
               <w:rPr>
                 <w:rFonts w:ascii="Consolas" w:hAnsi="Consolas"/>
-                <w:color w:val="B03060"/>
                 <w:sz w:val="20"/>
               </w:rPr>
               <w:t>created_at</w:t>
@@ -711,7 +897,6 @@
       <w:r>
         <w:rPr>
           <w:rFonts w:ascii="Consolas" w:hAnsi="Consolas"/>
-          <w:color w:val="B03060"/>
           <w:sz w:val="20"/>
         </w:rPr>
         <w:t>residents</w:t>
@@ -800,7 +985,6 @@
             <w:r>
               <w:rPr>
                 <w:rFonts w:ascii="Consolas" w:hAnsi="Consolas"/>
-                <w:color w:val="B03060"/>
                 <w:sz w:val="20"/>
               </w:rPr>
               <w:t>id</w:t>
@@ -837,7 +1021,6 @@
             <w:r>
               <w:rPr>
                 <w:rFonts w:ascii="Consolas" w:hAnsi="Consolas"/>
-                <w:color w:val="B03060"/>
                 <w:sz w:val="20"/>
               </w:rPr>
               <w:t>resident_no</w:t>
@@ -867,7 +1050,6 @@
             <w:r>
               <w:rPr>
                 <w:rFonts w:ascii="Consolas" w:hAnsi="Consolas"/>
-                <w:color w:val="B03060"/>
                 <w:sz w:val="20"/>
               </w:rPr>
               <w:t>RES-0001</w:t>
@@ -916,7 +1098,6 @@
             <w:r>
               <w:rPr>
                 <w:rFonts w:ascii="Consolas" w:hAnsi="Consolas"/>
-                <w:color w:val="B03060"/>
                 <w:sz w:val="20"/>
               </w:rPr>
               <w:t>households.id</w:t>
@@ -937,7 +1118,6 @@
             <w:r>
               <w:rPr>
                 <w:rFonts w:ascii="Consolas" w:hAnsi="Consolas"/>
-                <w:color w:val="B03060"/>
                 <w:sz w:val="20"/>
               </w:rPr>
               <w:t>first_name</w:t>
@@ -948,7 +1128,6 @@
             <w:r>
               <w:rPr>
                 <w:rFonts w:ascii="Consolas" w:hAnsi="Consolas"/>
-                <w:color w:val="B03060"/>
                 <w:sz w:val="20"/>
               </w:rPr>
               <w:t>last_name</w:t>
@@ -986,7 +1165,7 @@
               <w:rPr>
                 <w:i/>
               </w:rPr>
-              <w:t>`middle_name`, `suffix`</w:t>
+              <w:t>`middle_name`</w:t>
             </w:r>
           </w:p>
         </w:tc>
@@ -1020,7 +1199,6 @@
             <w:r>
               <w:rPr>
                 <w:rFonts w:ascii="Consolas" w:hAnsi="Consolas"/>
-                <w:color w:val="B03060"/>
                 <w:sz w:val="20"/>
               </w:rPr>
               <w:t>date_of_birth</w:t>
@@ -1044,6 +1222,9 @@
           </w:tcPr>
           <w:p>
             <w:r/>
+            <w:r>
+              <w:t>age is computed from this in the app</w:t>
+            </w:r>
           </w:p>
         </w:tc>
       </w:tr>
@@ -1057,47 +1238,6 @@
             <w:r>
               <w:rPr>
                 <w:rFonts w:ascii="Consolas" w:hAnsi="Consolas"/>
-                <w:color w:val="B03060"/>
-                <w:sz w:val="20"/>
-              </w:rPr>
-              <w:t>age</w:t>
-            </w:r>
-          </w:p>
-        </w:tc>
-        <w:tc>
-          <w:tcPr>
-            <w:tcW w:type="dxa" w:w="2880"/>
-          </w:tcPr>
-          <w:p>
-            <w:r/>
-            <w:r>
-              <w:t>int</w:t>
-            </w:r>
-          </w:p>
-        </w:tc>
-        <w:tc>
-          <w:tcPr>
-            <w:tcW w:type="dxa" w:w="2880"/>
-          </w:tcPr>
-          <w:p>
-            <w:r/>
-            <w:r>
-              <w:t>auto-set from DOB by trigger</w:t>
-            </w:r>
-          </w:p>
-        </w:tc>
-      </w:tr>
-      <w:tr>
-        <w:tc>
-          <w:tcPr>
-            <w:tcW w:type="dxa" w:w="2880"/>
-          </w:tcPr>
-          <w:p>
-            <w:r/>
-            <w:r>
-              <w:rPr>
-                <w:rFonts w:ascii="Consolas" w:hAnsi="Consolas"/>
-                <w:color w:val="B03060"/>
                 <w:sz w:val="20"/>
               </w:rPr>
               <w:t>sex</w:t>
@@ -1124,7 +1264,6 @@
             <w:r>
               <w:rPr>
                 <w:rFonts w:ascii="Consolas" w:hAnsi="Consolas"/>
-                <w:color w:val="B03060"/>
                 <w:sz w:val="20"/>
               </w:rPr>
               <w:t>Male</w:t>
@@ -1135,7 +1274,6 @@
             <w:r>
               <w:rPr>
                 <w:rFonts w:ascii="Consolas" w:hAnsi="Consolas"/>
-                <w:color w:val="B03060"/>
                 <w:sz w:val="20"/>
               </w:rPr>
               <w:t>Female</w:t>
@@ -1153,7 +1291,6 @@
             <w:r>
               <w:rPr>
                 <w:rFonts w:ascii="Consolas" w:hAnsi="Consolas"/>
-                <w:color w:val="B03060"/>
                 <w:sz w:val="20"/>
               </w:rPr>
               <w:t>civil_status</w:t>
@@ -1193,7 +1330,6 @@
             <w:r>
               <w:rPr>
                 <w:rFonts w:ascii="Consolas" w:hAnsi="Consolas"/>
-                <w:color w:val="B03060"/>
                 <w:sz w:val="20"/>
               </w:rPr>
               <w:t>purok</w:t>
@@ -1233,7 +1369,6 @@
             <w:r>
               <w:rPr>
                 <w:rFonts w:ascii="Consolas" w:hAnsi="Consolas"/>
-                <w:color w:val="B03060"/>
                 <w:sz w:val="20"/>
               </w:rPr>
               <w:t>is_household_head</w:t>
@@ -1263,7 +1398,6 @@
             <w:r>
               <w:rPr>
                 <w:rFonts w:ascii="Consolas" w:hAnsi="Consolas"/>
-                <w:color w:val="B03060"/>
                 <w:sz w:val="20"/>
               </w:rPr>
               <w:t>household_id</w:t>
@@ -1284,7 +1418,6 @@
             <w:r>
               <w:rPr>
                 <w:rFonts w:ascii="Consolas" w:hAnsi="Consolas"/>
-                <w:color w:val="B03060"/>
                 <w:sz w:val="20"/>
               </w:rPr>
               <w:t>is_voter</w:t>
@@ -1295,7 +1428,6 @@
             <w:r>
               <w:rPr>
                 <w:rFonts w:ascii="Consolas" w:hAnsi="Consolas"/>
-                <w:color w:val="B03060"/>
                 <w:sz w:val="20"/>
               </w:rPr>
               <w:t>is_pwd</w:t>
@@ -1306,7 +1438,6 @@
             <w:r>
               <w:rPr>
                 <w:rFonts w:ascii="Consolas" w:hAnsi="Consolas"/>
-                <w:color w:val="B03060"/>
                 <w:sz w:val="20"/>
               </w:rPr>
               <w:t>is_solo_parent</w:t>
@@ -1317,7 +1448,6 @@
             <w:r>
               <w:rPr>
                 <w:rFonts w:ascii="Consolas" w:hAnsi="Consolas"/>
-                <w:color w:val="B03060"/>
                 <w:sz w:val="20"/>
               </w:rPr>
               <w:t>is_senior_citizen</w:t>
@@ -1328,7 +1458,6 @@
             <w:r>
               <w:rPr>
                 <w:rFonts w:ascii="Consolas" w:hAnsi="Consolas"/>
-                <w:color w:val="B03060"/>
                 <w:sz w:val="20"/>
               </w:rPr>
               <w:t>is_out_of_school_youth</w:t>
@@ -1406,7 +1535,6 @@
             <w:r>
               <w:rPr>
                 <w:rFonts w:ascii="Consolas" w:hAnsi="Consolas"/>
-                <w:color w:val="B03060"/>
                 <w:sz w:val="20"/>
               </w:rPr>
               <w:t>monthly_income</w:t>
@@ -1443,7 +1571,6 @@
             <w:r>
               <w:rPr>
                 <w:rFonts w:ascii="Consolas" w:hAnsi="Consolas"/>
-                <w:color w:val="B03060"/>
                 <w:sz w:val="20"/>
               </w:rPr>
               <w:t>occupation</w:t>
@@ -1454,7 +1581,6 @@
             <w:r>
               <w:rPr>
                 <w:rFonts w:ascii="Consolas" w:hAnsi="Consolas"/>
-                <w:color w:val="B03060"/>
                 <w:sz w:val="20"/>
               </w:rPr>
               <w:t>contact_number</w:t>
@@ -1490,46 +1616,7 @@
             <w:r/>
             <w:r>
               <w:rPr>
-                <w:i/>
-              </w:rPr>
-              <w:t>`educational_attainment`, `philhealth_no`</w:t>
-            </w:r>
-          </w:p>
-        </w:tc>
-        <w:tc>
-          <w:tcPr>
-            <w:tcW w:type="dxa" w:w="2880"/>
-          </w:tcPr>
-          <w:p>
-            <w:r/>
-            <w:r>
-              <w:t>text</w:t>
-            </w:r>
-          </w:p>
-        </w:tc>
-        <w:tc>
-          <w:tcPr>
-            <w:tcW w:type="dxa" w:w="2880"/>
-          </w:tcPr>
-          <w:p>
-            <w:r/>
-            <w:r>
-              <w:t>legacy columns — retained in the table but no longer collected or shown in the UI (data minimization)</w:t>
-            </w:r>
-          </w:p>
-        </w:tc>
-      </w:tr>
-      <w:tr>
-        <w:tc>
-          <w:tcPr>
-            <w:tcW w:type="dxa" w:w="2880"/>
-          </w:tcPr>
-          <w:p>
-            <w:r/>
-            <w:r>
-              <w:rPr>
                 <w:rFonts w:ascii="Consolas" w:hAnsi="Consolas"/>
-                <w:color w:val="B03060"/>
                 <w:sz w:val="20"/>
               </w:rPr>
               <w:t>created_at</w:t>
@@ -1540,7 +1627,6 @@
             <w:r>
               <w:rPr>
                 <w:rFonts w:ascii="Consolas" w:hAnsi="Consolas"/>
-                <w:color w:val="B03060"/>
                 <w:sz w:val="20"/>
               </w:rPr>
               <w:t>updated_at</w:t>
@@ -1569,54 +1655,6 @@
       </w:tr>
     </w:tbl>
     <w:p/>
-    <w:p>
-      <w:pPr>
-        <w:ind w:left="360"/>
-      </w:pPr>
-      <w:r>
-        <w:rPr>
-          <w:b/>
-          <w:i/>
-        </w:rPr>
-        <w:t>View `residents_with_age`</w:t>
-      </w:r>
-      <w:r>
-        <w:rPr>
-          <w:i/>
-        </w:rPr>
-        <w:t xml:space="preserve"> = </w:t>
-      </w:r>
-      <w:r>
-        <w:rPr>
-          <w:rFonts w:ascii="Consolas" w:hAnsi="Consolas"/>
-          <w:i/>
-          <w:color w:val="B03060"/>
-          <w:sz w:val="20"/>
-        </w:rPr>
-        <w:t>residents</w:t>
-      </w:r>
-      <w:r>
-        <w:rPr>
-          <w:i/>
-        </w:rPr>
-        <w:t xml:space="preserve"> + computed </w:t>
-      </w:r>
-      <w:r>
-        <w:rPr>
-          <w:rFonts w:ascii="Consolas" w:hAnsi="Consolas"/>
-          <w:i/>
-          <w:color w:val="B03060"/>
-          <w:sz w:val="20"/>
-        </w:rPr>
-        <w:t>age</w:t>
-      </w:r>
-      <w:r>
-        <w:rPr>
-          <w:i/>
-        </w:rPr>
-        <w:t>. The Resident Profiling list reads from this view.</w:t>
-      </w:r>
-    </w:p>
     <w:p>
       <w:pPr>
         <w:pStyle w:val="Heading3"/>
@@ -1624,7 +1662,6 @@
       <w:r>
         <w:rPr>
           <w:rFonts w:ascii="Consolas" w:hAnsi="Consolas"/>
-          <w:color w:val="B03060"/>
           <w:sz w:val="20"/>
         </w:rPr>
         <w:t>households</w:t>
@@ -1713,7 +1750,6 @@
             <w:r>
               <w:rPr>
                 <w:rFonts w:ascii="Consolas" w:hAnsi="Consolas"/>
-                <w:color w:val="B03060"/>
                 <w:sz w:val="20"/>
               </w:rPr>
               <w:t>id</w:t>
@@ -1750,7 +1786,6 @@
             <w:r>
               <w:rPr>
                 <w:rFonts w:ascii="Consolas" w:hAnsi="Consolas"/>
-                <w:color w:val="B03060"/>
                 <w:sz w:val="20"/>
               </w:rPr>
               <w:t>household_no</w:t>
@@ -1780,7 +1815,6 @@
             <w:r>
               <w:rPr>
                 <w:rFonts w:ascii="Consolas" w:hAnsi="Consolas"/>
-                <w:color w:val="B03060"/>
                 <w:sz w:val="20"/>
               </w:rPr>
               <w:t>HH-0001</w:t>
@@ -1798,7 +1832,6 @@
             <w:r>
               <w:rPr>
                 <w:rFonts w:ascii="Consolas" w:hAnsi="Consolas"/>
-                <w:color w:val="B03060"/>
                 <w:sz w:val="20"/>
               </w:rPr>
               <w:t>purok</w:t>
@@ -1901,7 +1934,6 @@
             <w:r>
               <w:rPr>
                 <w:rFonts w:ascii="Consolas" w:hAnsi="Consolas"/>
-                <w:color w:val="B03060"/>
                 <w:sz w:val="20"/>
               </w:rPr>
               <w:t>residents.is_household_head</w:t>
@@ -1996,72 +2028,8 @@
           <w:p>
             <w:r/>
             <w:r>
-              <w:t>~~</w:t>
-            </w:r>
-            <w:r>
               <w:rPr>
                 <w:rFonts w:ascii="Consolas" w:hAnsi="Consolas"/>
-                <w:color w:val="B03060"/>
-                <w:sz w:val="20"/>
-              </w:rPr>
-              <w:t>water_source</w:t>
-            </w:r>
-            <w:r>
-              <w:t xml:space="preserve">, </w:t>
-            </w:r>
-            <w:r>
-              <w:rPr>
-                <w:rFonts w:ascii="Consolas" w:hAnsi="Consolas"/>
-                <w:color w:val="B03060"/>
-                <w:sz w:val="20"/>
-              </w:rPr>
-              <w:t>electricity</w:t>
-            </w:r>
-            <w:r>
-              <w:t>~~</w:t>
-            </w:r>
-          </w:p>
-        </w:tc>
-        <w:tc>
-          <w:tcPr>
-            <w:tcW w:type="dxa" w:w="2880"/>
-          </w:tcPr>
-          <w:p>
-            <w:r/>
-            <w:r>
-              <w:t>text/bool</w:t>
-            </w:r>
-          </w:p>
-        </w:tc>
-        <w:tc>
-          <w:tcPr>
-            <w:tcW w:type="dxa" w:w="2880"/>
-          </w:tcPr>
-          <w:p>
-            <w:r/>
-            <w:r>
-              <w:rPr>
-                <w:b/>
-              </w:rPr>
-              <w:t>deprecated</w:t>
-            </w:r>
-            <w:r>
-              <w:t xml:space="preserve"> — still in DB with defaults, no longer used by the app</w:t>
-            </w:r>
-          </w:p>
-        </w:tc>
-      </w:tr>
-      <w:tr>
-        <w:tc>
-          <w:tcPr>
-            <w:tcW w:type="dxa" w:w="2880"/>
-          </w:tcPr>
-          <w:p>
-            <w:r/>
-            <w:r>
-              <w:rPr>
-                <w:rFonts w:ascii="Consolas" w:hAnsi="Consolas"/>
-                <w:color w:val="B03060"/>
                 <w:sz w:val="20"/>
               </w:rPr>
               <w:t>created_at</w:t>
@@ -2072,7 +2040,6 @@
             <w:r>
               <w:rPr>
                 <w:rFonts w:ascii="Consolas" w:hAnsi="Consolas"/>
-                <w:color w:val="B03060"/>
                 <w:sz w:val="20"/>
               </w:rPr>
               <w:t>updated_at</w:t>
@@ -2108,7 +2075,6 @@
       <w:r>
         <w:rPr>
           <w:rFonts w:ascii="Consolas" w:hAnsi="Consolas"/>
-          <w:color w:val="B03060"/>
           <w:sz w:val="20"/>
         </w:rPr>
         <w:t>incidents</w:t>
@@ -2197,7 +2163,6 @@
             <w:r>
               <w:rPr>
                 <w:rFonts w:ascii="Consolas" w:hAnsi="Consolas"/>
-                <w:color w:val="B03060"/>
                 <w:sz w:val="20"/>
               </w:rPr>
               <w:t>id</w:t>
@@ -2234,7 +2199,6 @@
             <w:r>
               <w:rPr>
                 <w:rFonts w:ascii="Consolas" w:hAnsi="Consolas"/>
-                <w:color w:val="B03060"/>
                 <w:sz w:val="20"/>
               </w:rPr>
               <w:t>case_no</w:t>
@@ -2264,7 +2228,6 @@
             <w:r>
               <w:rPr>
                 <w:rFonts w:ascii="Consolas" w:hAnsi="Consolas"/>
-                <w:color w:val="B03060"/>
                 <w:sz w:val="20"/>
               </w:rPr>
               <w:t>INC-2025-001</w:t>
@@ -2282,7 +2245,6 @@
             <w:r>
               <w:rPr>
                 <w:rFonts w:ascii="Consolas" w:hAnsi="Consolas"/>
-                <w:color w:val="B03060"/>
                 <w:sz w:val="20"/>
               </w:rPr>
               <w:t>incident_type</w:t>
@@ -2322,7 +2284,6 @@
             <w:r>
               <w:rPr>
                 <w:rFonts w:ascii="Consolas" w:hAnsi="Consolas"/>
-                <w:color w:val="B03060"/>
                 <w:sz w:val="20"/>
               </w:rPr>
               <w:t>purok</w:t>
@@ -2363,7 +2324,7 @@
               <w:rPr>
                 <w:i/>
               </w:rPr>
-              <w:t>`complainant`, `respondent`, `description`</w:t>
+              <w:t>`complainant`, `description`</w:t>
             </w:r>
           </w:p>
         </w:tc>
@@ -2397,7 +2358,6 @@
             <w:r>
               <w:rPr>
                 <w:rFonts w:ascii="Consolas" w:hAnsi="Consolas"/>
-                <w:color w:val="B03060"/>
                 <w:sz w:val="20"/>
               </w:rPr>
               <w:t>incident_date</w:t>
@@ -2434,7 +2394,6 @@
             <w:r>
               <w:rPr>
                 <w:rFonts w:ascii="Consolas" w:hAnsi="Consolas"/>
-                <w:color w:val="B03060"/>
                 <w:sz w:val="20"/>
               </w:rPr>
               <w:t>status</w:t>
@@ -2461,41 +2420,6 @@
             <w:r>
               <w:t>Ongoing / Resolved / Escalated / Dismissed</w:t>
             </w:r>
-          </w:p>
-        </w:tc>
-      </w:tr>
-      <w:tr>
-        <w:tc>
-          <w:tcPr>
-            <w:tcW w:type="dxa" w:w="2880"/>
-          </w:tcPr>
-          <w:p>
-            <w:r/>
-            <w:r>
-              <w:rPr>
-                <w:i/>
-              </w:rPr>
-              <w:t>`resolved_date`</w:t>
-            </w:r>
-          </w:p>
-        </w:tc>
-        <w:tc>
-          <w:tcPr>
-            <w:tcW w:type="dxa" w:w="2880"/>
-          </w:tcPr>
-          <w:p>
-            <w:r/>
-            <w:r>
-              <w:t>date</w:t>
-            </w:r>
-          </w:p>
-        </w:tc>
-        <w:tc>
-          <w:tcPr>
-            <w:tcW w:type="dxa" w:w="2880"/>
-          </w:tcPr>
-          <w:p>
-            <w:r/>
           </w:p>
         </w:tc>
       </w:tr>
@@ -2616,10 +2540,9 @@
             <w:r>
               <w:rPr>
                 <w:rFonts w:ascii="Consolas" w:hAnsi="Consolas"/>
-                <w:color w:val="B03060"/>
                 <w:sz w:val="20"/>
               </w:rPr>
-              <w:t>auth.users</w:t>
+              <w:t>profiles.id</w:t>
             </w:r>
           </w:p>
         </w:tc>
@@ -2634,7 +2557,6 @@
             <w:r>
               <w:rPr>
                 <w:rFonts w:ascii="Consolas" w:hAnsi="Consolas"/>
-                <w:color w:val="B03060"/>
                 <w:sz w:val="20"/>
               </w:rPr>
               <w:t>created_at</w:t>
@@ -2645,7 +2567,6 @@
             <w:r>
               <w:rPr>
                 <w:rFonts w:ascii="Consolas" w:hAnsi="Consolas"/>
-                <w:color w:val="B03060"/>
                 <w:sz w:val="20"/>
               </w:rPr>
               <w:t>updated_at</w:t>
@@ -2681,7 +2602,6 @@
       <w:r>
         <w:rPr>
           <w:rFonts w:ascii="Consolas" w:hAnsi="Consolas"/>
-          <w:color w:val="B03060"/>
           <w:sz w:val="20"/>
         </w:rPr>
         <w:t>assistance_programs</w:t>
@@ -2770,7 +2690,6 @@
             <w:r>
               <w:rPr>
                 <w:rFonts w:ascii="Consolas" w:hAnsi="Consolas"/>
-                <w:color w:val="B03060"/>
                 <w:sz w:val="20"/>
               </w:rPr>
               <w:t>id</w:t>
@@ -2807,7 +2726,6 @@
             <w:r>
               <w:rPr>
                 <w:rFonts w:ascii="Consolas" w:hAnsi="Consolas"/>
-                <w:color w:val="B03060"/>
                 <w:sz w:val="20"/>
               </w:rPr>
               <w:t>name</w:t>
@@ -2879,7 +2797,6 @@
             <w:r>
               <w:rPr>
                 <w:rFonts w:ascii="Consolas" w:hAnsi="Consolas"/>
-                <w:color w:val="B03060"/>
                 <w:sz w:val="20"/>
               </w:rPr>
               <w:t>is_active</w:t>
@@ -2919,7 +2836,6 @@
             <w:r>
               <w:rPr>
                 <w:rFonts w:ascii="Consolas" w:hAnsi="Consolas"/>
-                <w:color w:val="B03060"/>
                 <w:sz w:val="20"/>
               </w:rPr>
               <w:t>created_at</w:t>
@@ -2955,7 +2871,6 @@
       <w:r>
         <w:rPr>
           <w:rFonts w:ascii="Consolas" w:hAnsi="Consolas"/>
-          <w:color w:val="B03060"/>
           <w:sz w:val="20"/>
         </w:rPr>
         <w:t>beneficiaries</w:t>
@@ -3044,7 +2959,6 @@
             <w:r>
               <w:rPr>
                 <w:rFonts w:ascii="Consolas" w:hAnsi="Consolas"/>
-                <w:color w:val="B03060"/>
                 <w:sz w:val="20"/>
               </w:rPr>
               <w:t>id</w:t>
@@ -3084,7 +2998,6 @@
             <w:r>
               <w:rPr>
                 <w:rFonts w:ascii="Consolas" w:hAnsi="Consolas"/>
-                <w:color w:val="B03060"/>
                 <w:sz w:val="20"/>
               </w:rPr>
               <w:t>resident_id</w:t>
@@ -3114,7 +3027,6 @@
             <w:r>
               <w:rPr>
                 <w:rFonts w:ascii="Consolas" w:hAnsi="Consolas"/>
-                <w:color w:val="B03060"/>
                 <w:sz w:val="20"/>
               </w:rPr>
               <w:t>residents.id</w:t>
@@ -3135,7 +3047,6 @@
             <w:r>
               <w:rPr>
                 <w:rFonts w:ascii="Consolas" w:hAnsi="Consolas"/>
-                <w:color w:val="B03060"/>
                 <w:sz w:val="20"/>
               </w:rPr>
               <w:t>program_id</w:t>
@@ -3165,7 +3076,6 @@
             <w:r>
               <w:rPr>
                 <w:rFonts w:ascii="Consolas" w:hAnsi="Consolas"/>
-                <w:color w:val="B03060"/>
                 <w:sz w:val="20"/>
               </w:rPr>
               <w:t>assistance_programs.id</w:t>
@@ -3183,7 +3093,6 @@
             <w:r>
               <w:rPr>
                 <w:rFonts w:ascii="Consolas" w:hAnsi="Consolas"/>
-                <w:color w:val="B03060"/>
                 <w:sz w:val="20"/>
               </w:rPr>
               <w:t>status</w:t>
@@ -3223,7 +3132,6 @@
             <w:r>
               <w:rPr>
                 <w:rFonts w:ascii="Consolas" w:hAnsi="Consolas"/>
-                <w:color w:val="B03060"/>
                 <w:sz w:val="20"/>
               </w:rPr>
               <w:t>enrolled_at</w:t>
@@ -3298,7 +3206,6 @@
             <w:r>
               <w:rPr>
                 <w:rFonts w:ascii="Consolas" w:hAnsi="Consolas"/>
-                <w:color w:val="B03060"/>
                 <w:sz w:val="20"/>
               </w:rPr>
               <w:t>total_released</w:t>
@@ -3407,7 +3314,6 @@
       <w:r>
         <w:rPr>
           <w:rFonts w:ascii="Consolas" w:hAnsi="Consolas"/>
-          <w:color w:val="B03060"/>
           <w:sz w:val="20"/>
         </w:rPr>
         <w:t>qr_verifications</w:t>
@@ -3496,7 +3402,6 @@
             <w:r>
               <w:rPr>
                 <w:rFonts w:ascii="Consolas" w:hAnsi="Consolas"/>
-                <w:color w:val="B03060"/>
                 <w:sz w:val="20"/>
               </w:rPr>
               <w:t>id</w:t>
@@ -3536,7 +3441,6 @@
             <w:r>
               <w:rPr>
                 <w:rFonts w:ascii="Consolas" w:hAnsi="Consolas"/>
-                <w:color w:val="B03060"/>
                 <w:sz w:val="20"/>
               </w:rPr>
               <w:t>resident_id</w:t>
@@ -3566,7 +3470,6 @@
             <w:r>
               <w:rPr>
                 <w:rFonts w:ascii="Consolas" w:hAnsi="Consolas"/>
-                <w:color w:val="B03060"/>
                 <w:sz w:val="20"/>
               </w:rPr>
               <w:t>residents.id</w:t>
@@ -3584,7 +3487,6 @@
             <w:r>
               <w:rPr>
                 <w:rFonts w:ascii="Consolas" w:hAnsi="Consolas"/>
-                <w:color w:val="B03060"/>
                 <w:sz w:val="20"/>
               </w:rPr>
               <w:t>purpose</w:t>
@@ -3622,58 +3524,8 @@
           <w:p>
             <w:r/>
             <w:r>
-              <w:t xml:space="preserve">🔗 </w:t>
-            </w:r>
-            <w:r>
-              <w:rPr>
-                <w:i/>
-              </w:rPr>
-              <w:t>`officer_id`</w:t>
-            </w:r>
-          </w:p>
-        </w:tc>
-        <w:tc>
-          <w:tcPr>
-            <w:tcW w:type="dxa" w:w="2880"/>
-          </w:tcPr>
-          <w:p>
-            <w:r/>
-            <w:r>
-              <w:t>uuid</w:t>
-            </w:r>
-          </w:p>
-        </w:tc>
-        <w:tc>
-          <w:tcPr>
-            <w:tcW w:type="dxa" w:w="2880"/>
-          </w:tcPr>
-          <w:p>
-            <w:r/>
-            <w:r>
-              <w:t xml:space="preserve">→ </w:t>
-            </w:r>
-            <w:r>
               <w:rPr>
                 <w:rFonts w:ascii="Consolas" w:hAnsi="Consolas"/>
-                <w:color w:val="B03060"/>
-                <w:sz w:val="20"/>
-              </w:rPr>
-              <w:t>auth.users</w:t>
-            </w:r>
-          </w:p>
-        </w:tc>
-      </w:tr>
-      <w:tr>
-        <w:tc>
-          <w:tcPr>
-            <w:tcW w:type="dxa" w:w="2880"/>
-          </w:tcPr>
-          <w:p>
-            <w:r/>
-            <w:r>
-              <w:rPr>
-                <w:rFonts w:ascii="Consolas" w:hAnsi="Consolas"/>
-                <w:color w:val="B03060"/>
                 <w:sz w:val="20"/>
               </w:rPr>
               <w:t>verified_at</w:t>
@@ -3709,7 +3561,6 @@
       <w:r>
         <w:rPr>
           <w:rFonts w:ascii="Consolas" w:hAnsi="Consolas"/>
-          <w:color w:val="B03060"/>
           <w:sz w:val="20"/>
         </w:rPr>
         <w:t>survey_responses</w:t>
@@ -3798,7 +3649,6 @@
             <w:r>
               <w:rPr>
                 <w:rFonts w:ascii="Consolas" w:hAnsi="Consolas"/>
-                <w:color w:val="B03060"/>
                 <w:sz w:val="20"/>
               </w:rPr>
               <w:t>id</w:t>
@@ -3866,7 +3716,6 @@
             <w:r>
               <w:rPr>
                 <w:rFonts w:ascii="Consolas" w:hAnsi="Consolas"/>
-                <w:color w:val="B03060"/>
                 <w:sz w:val="20"/>
               </w:rPr>
               <w:t>residents.id</w:t>
@@ -3887,7 +3736,6 @@
             <w:r>
               <w:rPr>
                 <w:rFonts w:ascii="Consolas" w:hAnsi="Consolas"/>
-                <w:color w:val="B03060"/>
                 <w:sz w:val="20"/>
               </w:rPr>
               <w:t>purok</w:t>
@@ -3924,7 +3772,6 @@
             <w:r>
               <w:rPr>
                 <w:rFonts w:ascii="Consolas" w:hAnsi="Consolas"/>
-                <w:color w:val="B03060"/>
                 <w:sz w:val="20"/>
               </w:rPr>
               <w:t>priority_need</w:t>
@@ -3965,7 +3812,7 @@
               <w:rPr>
                 <w:i/>
               </w:rPr>
-              <w:t>`other_need`, `comments`</w:t>
+              <w:t>`comments`</w:t>
             </w:r>
           </w:p>
         </w:tc>
@@ -3998,8 +3845,45 @@
             <w:r/>
             <w:r>
               <w:rPr>
+                <w:i/>
+              </w:rPr>
+              <w:t>`photo_url`</w:t>
+            </w:r>
+          </w:p>
+        </w:tc>
+        <w:tc>
+          <w:tcPr>
+            <w:tcW w:type="dxa" w:w="2880"/>
+          </w:tcPr>
+          <w:p>
+            <w:r/>
+            <w:r>
+              <w:t>text</w:t>
+            </w:r>
+          </w:p>
+        </w:tc>
+        <w:tc>
+          <w:tcPr>
+            <w:tcW w:type="dxa" w:w="2880"/>
+          </w:tcPr>
+          <w:p>
+            <w:r/>
+            <w:r>
+              <w:t>optional attached photo (Storage)</w:t>
+            </w:r>
+          </w:p>
+        </w:tc>
+      </w:tr>
+      <w:tr>
+        <w:tc>
+          <w:tcPr>
+            <w:tcW w:type="dxa" w:w="2880"/>
+          </w:tcPr>
+          <w:p>
+            <w:r/>
+            <w:r>
+              <w:rPr>
                 <w:rFonts w:ascii="Consolas" w:hAnsi="Consolas"/>
-                <w:color w:val="B03060"/>
                 <w:sz w:val="20"/>
               </w:rPr>
               <w:t>submitted_at</w:t>
@@ -4035,7 +3919,6 @@
       <w:r>
         <w:rPr>
           <w:rFonts w:ascii="Consolas" w:hAnsi="Consolas"/>
-          <w:color w:val="B03060"/>
           <w:sz w:val="20"/>
         </w:rPr>
         <w:t>announcements</w:t>
@@ -4124,7 +4007,6 @@
             <w:r>
               <w:rPr>
                 <w:rFonts w:ascii="Consolas" w:hAnsi="Consolas"/>
-                <w:color w:val="B03060"/>
                 <w:sz w:val="20"/>
               </w:rPr>
               <w:t>id</w:t>
@@ -4161,7 +4043,6 @@
             <w:r>
               <w:rPr>
                 <w:rFonts w:ascii="Consolas" w:hAnsi="Consolas"/>
-                <w:color w:val="B03060"/>
                 <w:sz w:val="20"/>
               </w:rPr>
               <w:t>title</w:t>
@@ -4172,7 +4053,6 @@
             <w:r>
               <w:rPr>
                 <w:rFonts w:ascii="Consolas" w:hAnsi="Consolas"/>
-                <w:color w:val="B03060"/>
                 <w:sz w:val="20"/>
               </w:rPr>
               <w:t>body</w:t>
@@ -4209,7 +4089,6 @@
             <w:r>
               <w:rPr>
                 <w:rFonts w:ascii="Consolas" w:hAnsi="Consolas"/>
-                <w:color w:val="B03060"/>
                 <w:sz w:val="20"/>
               </w:rPr>
               <w:t>category</w:t>
@@ -4249,7 +4128,6 @@
             <w:r>
               <w:rPr>
                 <w:rFonts w:ascii="Consolas" w:hAnsi="Consolas"/>
-                <w:color w:val="B03060"/>
                 <w:sz w:val="20"/>
               </w:rPr>
               <w:t>is_active</w:t>
@@ -4279,7 +4157,6 @@
             <w:r>
               <w:rPr>
                 <w:rFonts w:ascii="Consolas" w:hAnsi="Consolas"/>
-                <w:color w:val="B03060"/>
                 <w:sz w:val="20"/>
               </w:rPr>
               <w:t>/announcements</w:t>
@@ -4369,7 +4246,6 @@
             <w:r>
               <w:rPr>
                 <w:rFonts w:ascii="Consolas" w:hAnsi="Consolas"/>
-                <w:color w:val="B03060"/>
                 <w:sz w:val="20"/>
               </w:rPr>
               <w:t>auth.users</w:t>
@@ -4387,7 +4263,6 @@
             <w:r>
               <w:rPr>
                 <w:rFonts w:ascii="Consolas" w:hAnsi="Consolas"/>
-                <w:color w:val="B03060"/>
                 <w:sz w:val="20"/>
               </w:rPr>
               <w:t>created_at</w:t>
@@ -4423,7 +4298,6 @@
       <w:r>
         <w:rPr>
           <w:rFonts w:ascii="Consolas" w:hAnsi="Consolas"/>
-          <w:color w:val="B03060"/>
           <w:sz w:val="20"/>
         </w:rPr>
         <w:t>disaster_risk_zones</w:t>
@@ -4512,7 +4386,6 @@
             <w:r>
               <w:rPr>
                 <w:rFonts w:ascii="Consolas" w:hAnsi="Consolas"/>
-                <w:color w:val="B03060"/>
                 <w:sz w:val="20"/>
               </w:rPr>
               <w:t>id</w:t>
@@ -4549,7 +4422,6 @@
             <w:r>
               <w:rPr>
                 <w:rFonts w:ascii="Consolas" w:hAnsi="Consolas"/>
-                <w:color w:val="B03060"/>
                 <w:sz w:val="20"/>
               </w:rPr>
               <w:t>hazard_type</w:t>
@@ -4589,7 +4461,6 @@
             <w:r>
               <w:rPr>
                 <w:rFonts w:ascii="Consolas" w:hAnsi="Consolas"/>
-                <w:color w:val="B03060"/>
                 <w:sz w:val="20"/>
               </w:rPr>
               <w:t>risk_level</w:t>
@@ -4629,7 +4500,6 @@
             <w:r>
               <w:rPr>
                 <w:rFonts w:ascii="Consolas" w:hAnsi="Consolas"/>
-                <w:color w:val="B03060"/>
                 <w:sz w:val="20"/>
               </w:rPr>
               <w:t>purok</w:t>
@@ -4701,7 +4571,6 @@
             <w:r>
               <w:rPr>
                 <w:rFonts w:ascii="Consolas" w:hAnsi="Consolas"/>
-                <w:color w:val="B03060"/>
                 <w:sz w:val="20"/>
               </w:rPr>
               <w:t>radius</w:t>
@@ -4779,7 +4648,6 @@
             <w:r>
               <w:rPr>
                 <w:rFonts w:ascii="Consolas" w:hAnsi="Consolas"/>
-                <w:color w:val="B03060"/>
                 <w:sz w:val="20"/>
               </w:rPr>
               <w:t>created_at</w:t>
@@ -4815,7 +4683,6 @@
       <w:r>
         <w:rPr>
           <w:rFonts w:ascii="Consolas" w:hAnsi="Consolas"/>
-          <w:color w:val="B03060"/>
           <w:sz w:val="20"/>
         </w:rPr>
         <w:t>population_history</w:t>
@@ -4904,7 +4771,6 @@
             <w:r>
               <w:rPr>
                 <w:rFonts w:ascii="Consolas" w:hAnsi="Consolas"/>
-                <w:color w:val="B03060"/>
                 <w:sz w:val="20"/>
               </w:rPr>
               <w:t>id</w:t>
@@ -4941,7 +4807,6 @@
             <w:r>
               <w:rPr>
                 <w:rFonts w:ascii="Consolas" w:hAnsi="Consolas"/>
-                <w:color w:val="B03060"/>
                 <w:sz w:val="20"/>
               </w:rPr>
               <w:t>year</w:t>
@@ -4984,7 +4849,6 @@
             <w:r>
               <w:rPr>
                 <w:rFonts w:ascii="Consolas" w:hAnsi="Consolas"/>
-                <w:color w:val="B03060"/>
                 <w:sz w:val="20"/>
               </w:rPr>
               <w:t>total_population</w:t>
@@ -5008,6 +4872,9 @@
           </w:tcPr>
           <w:p>
             <w:r/>
+            <w:r>
+              <w:t>the only figure the forecast uses</w:t>
+            </w:r>
           </w:p>
         </w:tc>
       </w:tr>
@@ -5020,78 +4887,7 @@
             <w:r/>
             <w:r>
               <w:rPr>
-                <w:i/>
-              </w:rPr>
-              <w:t>`male_count`, `female_count`, `household_count`, `birth_count`, `death_count`, `migration_in`, `migration_out`</w:t>
-            </w:r>
-          </w:p>
-        </w:tc>
-        <w:tc>
-          <w:tcPr>
-            <w:tcW w:type="dxa" w:w="2880"/>
-          </w:tcPr>
-          <w:p>
-            <w:r/>
-            <w:r>
-              <w:t>int</w:t>
-            </w:r>
-          </w:p>
-        </w:tc>
-        <w:tc>
-          <w:tcPr>
-            <w:tcW w:type="dxa" w:w="2880"/>
-          </w:tcPr>
-          <w:p>
-            <w:r/>
-          </w:p>
-        </w:tc>
-      </w:tr>
-      <w:tr>
-        <w:tc>
-          <w:tcPr>
-            <w:tcW w:type="dxa" w:w="2880"/>
-          </w:tcPr>
-          <w:p>
-            <w:r/>
-            <w:r>
-              <w:rPr>
-                <w:i/>
-              </w:rPr>
-              <w:t>`source`</w:t>
-            </w:r>
-          </w:p>
-        </w:tc>
-        <w:tc>
-          <w:tcPr>
-            <w:tcW w:type="dxa" w:w="2880"/>
-          </w:tcPr>
-          <w:p>
-            <w:r/>
-            <w:r>
-              <w:t>text</w:t>
-            </w:r>
-          </w:p>
-        </w:tc>
-        <w:tc>
-          <w:tcPr>
-            <w:tcW w:type="dxa" w:w="2880"/>
-          </w:tcPr>
-          <w:p>
-            <w:r/>
-          </w:p>
-        </w:tc>
-      </w:tr>
-      <w:tr>
-        <w:tc>
-          <w:tcPr>
-            <w:tcW w:type="dxa" w:w="2880"/>
-          </w:tcPr>
-          <w:p>
-            <w:r/>
-            <w:r>
-              <w:rPr>
                 <w:rFonts w:ascii="Consolas" w:hAnsi="Consolas"/>
-                <w:color w:val="B03060"/>
                 <w:sz w:val="20"/>
               </w:rPr>
               <w:t>created_at</w:t>
@@ -5127,7 +4923,6 @@
       <w:r>
         <w:rPr>
           <w:rFonts w:ascii="Consolas" w:hAnsi="Consolas"/>
-          <w:color w:val="B03060"/>
           <w:sz w:val="20"/>
         </w:rPr>
         <w:t>audit_logs</w:t>
@@ -5216,7 +5011,6 @@
             <w:r>
               <w:rPr>
                 <w:rFonts w:ascii="Consolas" w:hAnsi="Consolas"/>
-                <w:color w:val="B03060"/>
                 <w:sz w:val="20"/>
               </w:rPr>
               <w:t>id</w:t>
@@ -5253,7 +5047,6 @@
             <w:r>
               <w:rPr>
                 <w:rFonts w:ascii="Consolas" w:hAnsi="Consolas"/>
-                <w:color w:val="B03060"/>
                 <w:sz w:val="20"/>
               </w:rPr>
               <w:t>table_name</w:t>
@@ -5290,7 +5083,6 @@
             <w:r>
               <w:rPr>
                 <w:rFonts w:ascii="Consolas" w:hAnsi="Consolas"/>
-                <w:color w:val="B03060"/>
                 <w:sz w:val="20"/>
               </w:rPr>
               <w:t>action</w:t>
@@ -5437,7 +5229,6 @@
             <w:r>
               <w:rPr>
                 <w:rFonts w:ascii="Consolas" w:hAnsi="Consolas"/>
-                <w:color w:val="B03060"/>
                 <w:sz w:val="20"/>
               </w:rPr>
               <w:t>auth.users</w:t>
@@ -5455,7 +5246,6 @@
             <w:r>
               <w:rPr>
                 <w:rFonts w:ascii="Consolas" w:hAnsi="Consolas"/>
-                <w:color w:val="B03060"/>
                 <w:sz w:val="20"/>
               </w:rPr>
               <w:t>changed_at</w:t>
@@ -5569,7 +5359,6 @@
             <w:r>
               <w:rPr>
                 <w:rFonts w:ascii="Consolas" w:hAnsi="Consolas"/>
-                <w:color w:val="B03060"/>
                 <w:sz w:val="20"/>
               </w:rPr>
               <w:t>incident-photos</w:t>
@@ -5596,7 +5385,6 @@
             <w:r>
               <w:rPr>
                 <w:rFonts w:ascii="Consolas" w:hAnsi="Consolas"/>
-                <w:color w:val="B03060"/>
                 <w:sz w:val="20"/>
               </w:rPr>
               <w:t>incidents.photo_url</w:t>
@@ -5614,7 +5402,6 @@
             <w:r>
               <w:rPr>
                 <w:rFonts w:ascii="Consolas" w:hAnsi="Consolas"/>
-                <w:color w:val="B03060"/>
                 <w:sz w:val="20"/>
               </w:rPr>
               <w:t>announcement-photos</w:t>
@@ -5641,10 +5428,52 @@
             <w:r>
               <w:rPr>
                 <w:rFonts w:ascii="Consolas" w:hAnsi="Consolas"/>
-                <w:color w:val="B03060"/>
                 <w:sz w:val="20"/>
               </w:rPr>
               <w:t>announcements.image_url</w:t>
+            </w:r>
+          </w:p>
+        </w:tc>
+      </w:tr>
+      <w:tr>
+        <w:tc>
+          <w:tcPr>
+            <w:tcW w:type="dxa" w:w="2880"/>
+          </w:tcPr>
+          <w:p>
+            <w:r/>
+            <w:r>
+              <w:rPr>
+                <w:rFonts w:ascii="Consolas" w:hAnsi="Consolas"/>
+                <w:sz w:val="20"/>
+              </w:rPr>
+              <w:t>needs-photos</w:t>
+            </w:r>
+          </w:p>
+        </w:tc>
+        <w:tc>
+          <w:tcPr>
+            <w:tcW w:type="dxa" w:w="2880"/>
+          </w:tcPr>
+          <w:p>
+            <w:r/>
+            <w:r>
+              <w:t>community needs photos</w:t>
+            </w:r>
+          </w:p>
+        </w:tc>
+        <w:tc>
+          <w:tcPr>
+            <w:tcW w:type="dxa" w:w="2880"/>
+          </w:tcPr>
+          <w:p>
+            <w:r/>
+            <w:r>
+              <w:rPr>
+                <w:rFonts w:ascii="Consolas" w:hAnsi="Consolas"/>
+                <w:sz w:val="20"/>
+              </w:rPr>
+              <w:t>survey_responses.photo_url</w:t>
             </w:r>
           </w:p>
         </w:tc>
@@ -5763,7 +5592,6 @@
             <w:r>
               <w:rPr>
                 <w:rFonts w:ascii="Consolas" w:hAnsi="Consolas"/>
-                <w:color w:val="B03060"/>
                 <w:sz w:val="20"/>
               </w:rPr>
               <w:t>residents.household_id</w:t>
@@ -5779,7 +5607,6 @@
             <w:r>
               <w:rPr>
                 <w:rFonts w:ascii="Consolas" w:hAnsi="Consolas"/>
-                <w:color w:val="B03060"/>
                 <w:sz w:val="20"/>
               </w:rPr>
               <w:t>households.id</w:t>
@@ -5819,7 +5646,6 @@
             <w:r>
               <w:rPr>
                 <w:rFonts w:ascii="Consolas" w:hAnsi="Consolas"/>
-                <w:color w:val="B03060"/>
                 <w:sz w:val="20"/>
               </w:rPr>
               <w:t>beneficiaries.resident_id</w:t>
@@ -5835,7 +5661,6 @@
             <w:r>
               <w:rPr>
                 <w:rFonts w:ascii="Consolas" w:hAnsi="Consolas"/>
-                <w:color w:val="B03060"/>
                 <w:sz w:val="20"/>
               </w:rPr>
               <w:t>residents.id</w:t>
@@ -5875,7 +5700,6 @@
             <w:r>
               <w:rPr>
                 <w:rFonts w:ascii="Consolas" w:hAnsi="Consolas"/>
-                <w:color w:val="B03060"/>
                 <w:sz w:val="20"/>
               </w:rPr>
               <w:t>beneficiaries.program_id</w:t>
@@ -5891,7 +5715,6 @@
             <w:r>
               <w:rPr>
                 <w:rFonts w:ascii="Consolas" w:hAnsi="Consolas"/>
-                <w:color w:val="B03060"/>
                 <w:sz w:val="20"/>
               </w:rPr>
               <w:t>assistance_programs.id</w:t>
@@ -5931,7 +5754,6 @@
             <w:r>
               <w:rPr>
                 <w:rFonts w:ascii="Consolas" w:hAnsi="Consolas"/>
-                <w:color w:val="B03060"/>
                 <w:sz w:val="20"/>
               </w:rPr>
               <w:t>qr_verifications.resident_id</w:t>
@@ -5947,7 +5769,6 @@
             <w:r>
               <w:rPr>
                 <w:rFonts w:ascii="Consolas" w:hAnsi="Consolas"/>
-                <w:color w:val="B03060"/>
                 <w:sz w:val="20"/>
               </w:rPr>
               <w:t>residents.id</w:t>
@@ -5987,7 +5808,6 @@
             <w:r>
               <w:rPr>
                 <w:rFonts w:ascii="Consolas" w:hAnsi="Consolas"/>
-                <w:color w:val="B03060"/>
                 <w:sz w:val="20"/>
               </w:rPr>
               <w:t>survey_responses.resident_id</w:t>
@@ -6003,7 +5823,6 @@
             <w:r>
               <w:rPr>
                 <w:rFonts w:ascii="Consolas" w:hAnsi="Consolas"/>
-                <w:color w:val="B03060"/>
                 <w:sz w:val="20"/>
               </w:rPr>
               <w:t>residents.id</w:t>
@@ -6049,7 +5868,6 @@
             <w:r>
               <w:rPr>
                 <w:rFonts w:ascii="Consolas" w:hAnsi="Consolas"/>
-                <w:color w:val="B03060"/>
                 <w:sz w:val="20"/>
               </w:rPr>
               <w:t>profiles.id</w:t>
@@ -6065,7 +5883,6 @@
             <w:r>
               <w:rPr>
                 <w:rFonts w:ascii="Consolas" w:hAnsi="Consolas"/>
-                <w:color w:val="B03060"/>
                 <w:sz w:val="20"/>
               </w:rPr>
               <w:t>auth.users.id</w:t>
@@ -6105,18 +5922,60 @@
             <w:r>
               <w:rPr>
                 <w:rFonts w:ascii="Consolas" w:hAnsi="Consolas"/>
-                <w:color w:val="B03060"/>
                 <w:sz w:val="20"/>
               </w:rPr>
               <w:t>incidents.officer_id</w:t>
             </w:r>
-            <w:r>
-              <w:t xml:space="preserve"> / </w:t>
-            </w:r>
+          </w:p>
+        </w:tc>
+        <w:tc>
+          <w:tcPr>
+            <w:tcW w:type="dxa" w:w="2160"/>
+          </w:tcPr>
+          <w:p>
+            <w:r/>
             <w:r>
               <w:rPr>
                 <w:rFonts w:ascii="Consolas" w:hAnsi="Consolas"/>
-                <w:color w:val="B03060"/>
+                <w:sz w:val="20"/>
+              </w:rPr>
+              <w:t>profiles.id</w:t>
+            </w:r>
+          </w:p>
+        </w:tc>
+        <w:tc>
+          <w:tcPr>
+            <w:tcW w:type="dxa" w:w="2160"/>
+          </w:tcPr>
+          <w:p>
+            <w:r/>
+            <w:r>
+              <w:t>many-to-one</w:t>
+            </w:r>
+          </w:p>
+        </w:tc>
+        <w:tc>
+          <w:tcPr>
+            <w:tcW w:type="dxa" w:w="2160"/>
+          </w:tcPr>
+          <w:p>
+            <w:r/>
+            <w:r>
+              <w:t>which staff logged the incident</w:t>
+            </w:r>
+          </w:p>
+        </w:tc>
+      </w:tr>
+      <w:tr>
+        <w:tc>
+          <w:tcPr>
+            <w:tcW w:type="dxa" w:w="2160"/>
+          </w:tcPr>
+          <w:p>
+            <w:r/>
+            <w:r>
+              <w:rPr>
+                <w:rFonts w:ascii="Consolas" w:hAnsi="Consolas"/>
                 <w:sz w:val="20"/>
               </w:rPr>
               <w:t>announcements.posted_by</w:t>
@@ -6127,34 +5986,21 @@
             <w:r>
               <w:rPr>
                 <w:rFonts w:ascii="Consolas" w:hAnsi="Consolas"/>
-                <w:color w:val="B03060"/>
                 <w:sz w:val="20"/>
               </w:rPr>
               <w:t>audit_logs.changed_by</w:t>
             </w:r>
-            <w:r>
-              <w:t xml:space="preserve"> / </w:t>
-            </w:r>
+          </w:p>
+        </w:tc>
+        <w:tc>
+          <w:tcPr>
+            <w:tcW w:type="dxa" w:w="2160"/>
+          </w:tcPr>
+          <w:p>
+            <w:r/>
             <w:r>
               <w:rPr>
                 <w:rFonts w:ascii="Consolas" w:hAnsi="Consolas"/>
-                <w:color w:val="B03060"/>
-                <w:sz w:val="20"/>
-              </w:rPr>
-              <w:t>qr_verifications.officer_id</w:t>
-            </w:r>
-          </w:p>
-        </w:tc>
-        <w:tc>
-          <w:tcPr>
-            <w:tcW w:type="dxa" w:w="2160"/>
-          </w:tcPr>
-          <w:p>
-            <w:r/>
-            <w:r>
-              <w:rPr>
-                <w:rFonts w:ascii="Consolas" w:hAnsi="Consolas"/>
-                <w:color w:val="B03060"/>
                 <w:sz w:val="20"/>
               </w:rPr>
               <w:t>auth.users.id</w:t>
@@ -6179,7 +6025,7 @@
           <w:p>
             <w:r/>
             <w:r>
-              <w:t>who created/changed the record</w:t>
+              <w:t>who posted/changed the record</w:t>
             </w:r>
           </w:p>
         </w:tc>
@@ -6218,7 +6064,6 @@
         <w:rPr>
           <w:rFonts w:ascii="Consolas" w:hAnsi="Consolas"/>
           <w:i/>
-          <w:color w:val="B03060"/>
           <w:sz w:val="20"/>
         </w:rPr>
         <w:t>is_household_head = true</w:t>
@@ -6233,7 +6078,6 @@
         <w:rPr>
           <w:rFonts w:ascii="Consolas" w:hAnsi="Consolas"/>
           <w:i/>
-          <w:color w:val="B03060"/>
           <w:sz w:val="20"/>
         </w:rPr>
         <w:t>household_id</w:t>
@@ -6259,7 +6103,6 @@
         <w:rPr>
           <w:rFonts w:ascii="Consolas" w:hAnsi="Consolas"/>
           <w:i/>
-          <w:color w:val="B03060"/>
           <w:sz w:val="20"/>
         </w:rPr>
         <w:t>households.head_name</w:t>
@@ -6297,7 +6140,6 @@
         <w:rPr>
           <w:rFonts w:ascii="Consolas" w:hAnsi="Consolas"/>
           <w:i/>
-          <w:color w:val="B03060"/>
           <w:sz w:val="20"/>
         </w:rPr>
         <w:t>DATABASE_SETUP.sql</w:t>
@@ -6334,7 +6176,6 @@
         <w:rPr>
           <w:rFonts w:ascii="Consolas" w:hAnsi="Consolas"/>
           <w:i/>
-          <w:color w:val="B03060"/>
           <w:sz w:val="20"/>
         </w:rPr>
         <w:t>household_id → NULL</w:t>
@@ -6350,7 +6191,6 @@
       <w:r>
         <w:rPr>
           <w:rFonts w:ascii="Consolas" w:hAnsi="Consolas"/>
-          <w:color w:val="B03060"/>
           <w:sz w:val="20"/>
         </w:rPr>
         <w:t>beneficiaries</w:t>
@@ -6370,7 +6210,6 @@
       <w:r>
         <w:rPr>
           <w:rFonts w:ascii="Consolas" w:hAnsi="Consolas"/>
-          <w:color w:val="B03060"/>
           <w:sz w:val="20"/>
         </w:rPr>
         <w:t>residents</w:t>
@@ -6383,7 +6222,6 @@
       <w:r>
         <w:rPr>
           <w:rFonts w:ascii="Consolas" w:hAnsi="Consolas"/>
-          <w:color w:val="B03060"/>
           <w:sz w:val="20"/>
         </w:rPr>
         <w:t>assistance_programs</w:t>
@@ -6409,13 +6247,10 @@
       </w:r>
     </w:p>
     <w:p>
-      <w:pPr>
-        <w:ind w:left="240"/>
-      </w:pPr>
       <w:r>
         <w:rPr>
           <w:rFonts w:ascii="Consolas" w:hAnsi="Consolas"/>
-          <w:sz w:val="19"/>
+          <w:sz w:val="17"/>
         </w:rPr>
         <w:t>erDiagram</w:t>
         <w:br/>
@@ -6431,7 +6266,7 @@
         <w:br/>
         <w:t xml:space="preserve">    RESIDENTS ||--o{ SURVEY_RESPONSES : "submits"</w:t>
         <w:br/>
-        <w:t xml:space="preserve">    AUTH_USERS ||--o{ INCIDENTS : "logs (officer_id)"</w:t>
+        <w:t xml:space="preserve">    PROFILES ||--o{ INCIDENTS : "logs (officer_id)"</w:t>
         <w:br/>
         <w:t xml:space="preserve">    AUTH_USERS ||--o{ ANNOUNCEMENTS : "posts (posted_by)"</w:t>
         <w:br/>
@@ -6617,7 +6452,6 @@
         <w:rPr>
           <w:rFonts w:ascii="Consolas" w:hAnsi="Consolas"/>
           <w:i/>
-          <w:color w:val="B03060"/>
           <w:sz w:val="20"/>
         </w:rPr>
         <w:t>INCIDENTS</w:t>
@@ -6626,13 +6460,40 @@
         <w:rPr>
           <w:i/>
         </w:rPr>
-        <w:t xml:space="preserve">, </w:t>
+        <w:t xml:space="preserve"> links to </w:t>
       </w:r>
       <w:r>
         <w:rPr>
           <w:rFonts w:ascii="Consolas" w:hAnsi="Consolas"/>
           <w:i/>
-          <w:color w:val="B03060"/>
+          <w:sz w:val="20"/>
+        </w:rPr>
+        <w:t>PROFILES</w:t>
+      </w:r>
+      <w:r>
+        <w:rPr>
+          <w:i/>
+        </w:rPr>
+        <w:t xml:space="preserve"> via </w:t>
+      </w:r>
+      <w:r>
+        <w:rPr>
+          <w:rFonts w:ascii="Consolas" w:hAnsi="Consolas"/>
+          <w:i/>
+          <w:sz w:val="20"/>
+        </w:rPr>
+        <w:t>officer_id</w:t>
+      </w:r>
+      <w:r>
+        <w:rPr>
+          <w:i/>
+        </w:rPr>
+        <w:t xml:space="preserve">; </w:t>
+      </w:r>
+      <w:r>
+        <w:rPr>
+          <w:rFonts w:ascii="Consolas" w:hAnsi="Consolas"/>
+          <w:i/>
           <w:sz w:val="20"/>
         </w:rPr>
         <w:t>ANNOUNCEMENTS</w:t>
@@ -6641,13 +6502,12 @@
         <w:rPr>
           <w:i/>
         </w:rPr>
-        <w:t xml:space="preserve">, and </w:t>
+        <w:t xml:space="preserve"> and </w:t>
       </w:r>
       <w:r>
         <w:rPr>
           <w:rFonts w:ascii="Consolas" w:hAnsi="Consolas"/>
           <w:i/>
-          <w:color w:val="B03060"/>
           <w:sz w:val="20"/>
         </w:rPr>
         <w:t>AUDIT_LOGS</w:t>
@@ -6656,13 +6516,17 @@
         <w:rPr>
           <w:i/>
         </w:rPr>
-        <w:t xml:space="preserve"> link to </w:t>
+        <w:t xml:space="preserve"> link to</w:t>
       </w:r>
+    </w:p>
+    <w:p>
+      <w:pPr>
+        <w:ind w:left="360"/>
+      </w:pPr>
       <w:r>
         <w:rPr>
           <w:rFonts w:ascii="Consolas" w:hAnsi="Consolas"/>
           <w:i/>
-          <w:color w:val="B03060"/>
           <w:sz w:val="20"/>
         </w:rPr>
         <w:t>AUTH_USERS</w:t>
@@ -6671,39 +6535,12 @@
         <w:rPr>
           <w:i/>
         </w:rPr>
-        <w:t xml:space="preserve"> through the user who</w:t>
-      </w:r>
-    </w:p>
-    <w:p>
-      <w:pPr>
-        <w:ind w:left="360"/>
-      </w:pPr>
-      <w:r>
-        <w:rPr>
-          <w:i/>
-        </w:rPr>
-        <w:t>created the record (</w:t>
+        <w:t xml:space="preserve"> via </w:t>
       </w:r>
       <w:r>
         <w:rPr>
           <w:rFonts w:ascii="Consolas" w:hAnsi="Consolas"/>
           <w:i/>
-          <w:color w:val="B03060"/>
-          <w:sz w:val="20"/>
-        </w:rPr>
-        <w:t>officer_id</w:t>
-      </w:r>
-      <w:r>
-        <w:rPr>
-          <w:i/>
-        </w:rPr>
-        <w:t xml:space="preserve"> / </w:t>
-      </w:r>
-      <w:r>
-        <w:rPr>
-          <w:rFonts w:ascii="Consolas" w:hAnsi="Consolas"/>
-          <w:i/>
-          <w:color w:val="B03060"/>
           <w:sz w:val="20"/>
         </w:rPr>
         <w:t>posted_by</w:t>
@@ -6718,7 +6555,6 @@
         <w:rPr>
           <w:rFonts w:ascii="Consolas" w:hAnsi="Consolas"/>
           <w:i/>
-          <w:color w:val="B03060"/>
           <w:sz w:val="20"/>
         </w:rPr>
         <w:t>changed_by</w:t>
@@ -6727,13 +6563,12 @@
         <w:rPr>
           <w:i/>
         </w:rPr>
-        <w:t xml:space="preserve">). </w:t>
+        <w:t xml:space="preserve"> (the user who created the record). </w:t>
       </w:r>
       <w:r>
         <w:rPr>
           <w:rFonts w:ascii="Consolas" w:hAnsi="Consolas"/>
           <w:i/>
-          <w:color w:val="B03060"/>
           <w:sz w:val="20"/>
         </w:rPr>
         <w:t>DISASTER_RISK_ZONES</w:t>
@@ -6753,7 +6588,6 @@
         <w:rPr>
           <w:rFonts w:ascii="Consolas" w:hAnsi="Consolas"/>
           <w:i/>
-          <w:color w:val="B03060"/>
           <w:sz w:val="20"/>
         </w:rPr>
         <w:t>POPULATION_HISTORY</w:t>
@@ -6786,7 +6620,6 @@
         <w:rPr>
           <w:rFonts w:ascii="Consolas" w:hAnsi="Consolas"/>
           <w:i/>
-          <w:color w:val="B03060"/>
           <w:sz w:val="20"/>
         </w:rPr>
         <w:t>purok</w:t>
@@ -6801,7 +6634,6 @@
         <w:rPr>
           <w:rFonts w:ascii="Consolas" w:hAnsi="Consolas"/>
           <w:i/>
-          <w:color w:val="B03060"/>
           <w:sz w:val="20"/>
         </w:rPr>
         <w:t>year</w:t>
@@ -6903,7 +6735,6 @@
             <w:r>
               <w:rPr>
                 <w:rFonts w:ascii="Consolas" w:hAnsi="Consolas"/>
-                <w:color w:val="B03060"/>
                 <w:sz w:val="20"/>
               </w:rPr>
               <w:t>profiles</w:t>
@@ -6935,7 +6766,6 @@
             <w:r>
               <w:rPr>
                 <w:rFonts w:ascii="Consolas" w:hAnsi="Consolas"/>
-                <w:color w:val="B03060"/>
                 <w:sz w:val="20"/>
               </w:rPr>
               <w:t>profiles</w:t>
@@ -6967,29 +6797,16 @@
             <w:r>
               <w:rPr>
                 <w:rFonts w:ascii="Consolas" w:hAnsi="Consolas"/>
-                <w:color w:val="B03060"/>
-                <w:sz w:val="20"/>
-              </w:rPr>
-              <w:t>residents_with_age</w:t>
-            </w:r>
-            <w:r>
-              <w:t xml:space="preserve"> (R), </w:t>
-            </w:r>
-            <w:r>
-              <w:rPr>
-                <w:rFonts w:ascii="Consolas" w:hAnsi="Consolas"/>
-                <w:color w:val="B03060"/>
                 <w:sz w:val="20"/>
               </w:rPr>
               <w:t>residents</w:t>
             </w:r>
             <w:r>
-              <w:t xml:space="preserve"> (W), </w:t>
+              <w:t xml:space="preserve"> (R/W), </w:t>
             </w:r>
             <w:r>
               <w:rPr>
                 <w:rFonts w:ascii="Consolas" w:hAnsi="Consolas"/>
-                <w:color w:val="B03060"/>
                 <w:sz w:val="20"/>
               </w:rPr>
               <w:t>households</w:t>
@@ -7021,7 +6838,6 @@
             <w:r>
               <w:rPr>
                 <w:rFonts w:ascii="Consolas" w:hAnsi="Consolas"/>
-                <w:color w:val="B03060"/>
                 <w:sz w:val="20"/>
               </w:rPr>
               <w:t>households</w:t>
@@ -7032,7 +6848,6 @@
             <w:r>
               <w:rPr>
                 <w:rFonts w:ascii="Consolas" w:hAnsi="Consolas"/>
-                <w:color w:val="B03060"/>
                 <w:sz w:val="20"/>
               </w:rPr>
               <w:t>residents</w:t>
@@ -7064,7 +6879,6 @@
             <w:r>
               <w:rPr>
                 <w:rFonts w:ascii="Consolas" w:hAnsi="Consolas"/>
-                <w:color w:val="B03060"/>
                 <w:sz w:val="20"/>
               </w:rPr>
               <w:t>incidents</w:t>
@@ -7075,7 +6889,6 @@
             <w:r>
               <w:rPr>
                 <w:rFonts w:ascii="Consolas" w:hAnsi="Consolas"/>
-                <w:color w:val="B03060"/>
                 <w:sz w:val="20"/>
               </w:rPr>
               <w:t>incident-photos</w:t>
@@ -7107,7 +6920,6 @@
             <w:r>
               <w:rPr>
                 <w:rFonts w:ascii="Consolas" w:hAnsi="Consolas"/>
-                <w:color w:val="B03060"/>
                 <w:sz w:val="20"/>
               </w:rPr>
               <w:t>incidents</w:t>
@@ -7139,7 +6951,6 @@
             <w:r>
               <w:rPr>
                 <w:rFonts w:ascii="Consolas" w:hAnsi="Consolas"/>
-                <w:color w:val="B03060"/>
                 <w:sz w:val="20"/>
               </w:rPr>
               <w:t>disaster_risk_zones</w:t>
@@ -7150,7 +6961,6 @@
             <w:r>
               <w:rPr>
                 <w:rFonts w:ascii="Consolas" w:hAnsi="Consolas"/>
-                <w:color w:val="B03060"/>
                 <w:sz w:val="20"/>
               </w:rPr>
               <w:t>households</w:t>
@@ -7182,7 +6992,6 @@
             <w:r>
               <w:rPr>
                 <w:rFonts w:ascii="Consolas" w:hAnsi="Consolas"/>
-                <w:color w:val="B03060"/>
                 <w:sz w:val="20"/>
               </w:rPr>
               <w:t>beneficiaries</w:t>
@@ -7193,7 +7002,6 @@
             <w:r>
               <w:rPr>
                 <w:rFonts w:ascii="Consolas" w:hAnsi="Consolas"/>
-                <w:color w:val="B03060"/>
                 <w:sz w:val="20"/>
               </w:rPr>
               <w:t>assistance_programs</w:t>
@@ -7204,7 +7012,6 @@
             <w:r>
               <w:rPr>
                 <w:rFonts w:ascii="Consolas" w:hAnsi="Consolas"/>
-                <w:color w:val="B03060"/>
                 <w:sz w:val="20"/>
               </w:rPr>
               <w:t>residents</w:t>
@@ -7236,7 +7043,6 @@
             <w:r>
               <w:rPr>
                 <w:rFonts w:ascii="Consolas" w:hAnsi="Consolas"/>
-                <w:color w:val="B03060"/>
                 <w:sz w:val="20"/>
               </w:rPr>
               <w:t>residents</w:t>
@@ -7247,7 +7053,6 @@
             <w:r>
               <w:rPr>
                 <w:rFonts w:ascii="Consolas" w:hAnsi="Consolas"/>
-                <w:color w:val="B03060"/>
                 <w:sz w:val="20"/>
               </w:rPr>
               <w:t>households</w:t>
@@ -7258,7 +7063,6 @@
             <w:r>
               <w:rPr>
                 <w:rFonts w:ascii="Consolas" w:hAnsi="Consolas"/>
-                <w:color w:val="B03060"/>
                 <w:sz w:val="20"/>
               </w:rPr>
               <w:t>beneficiaries</w:t>
@@ -7269,7 +7073,6 @@
             <w:r>
               <w:rPr>
                 <w:rFonts w:ascii="Consolas" w:hAnsi="Consolas"/>
-                <w:color w:val="B03060"/>
                 <w:sz w:val="20"/>
               </w:rPr>
               <w:t>qr_verifications</w:t>
@@ -7301,7 +7104,6 @@
             <w:r>
               <w:rPr>
                 <w:rFonts w:ascii="Consolas" w:hAnsi="Consolas"/>
-                <w:color w:val="B03060"/>
                 <w:sz w:val="20"/>
               </w:rPr>
               <w:t>survey_responses</w:t>
@@ -7333,7 +7135,6 @@
             <w:r>
               <w:rPr>
                 <w:rFonts w:ascii="Consolas" w:hAnsi="Consolas"/>
-                <w:color w:val="B03060"/>
                 <w:sz w:val="20"/>
               </w:rPr>
               <w:t>survey_responses</w:t>
@@ -7365,7 +7166,6 @@
             <w:r>
               <w:rPr>
                 <w:rFonts w:ascii="Consolas" w:hAnsi="Consolas"/>
-                <w:color w:val="B03060"/>
                 <w:sz w:val="20"/>
               </w:rPr>
               <w:t>announcements</w:t>
@@ -7376,7 +7176,6 @@
             <w:r>
               <w:rPr>
                 <w:rFonts w:ascii="Consolas" w:hAnsi="Consolas"/>
-                <w:color w:val="B03060"/>
                 <w:sz w:val="20"/>
               </w:rPr>
               <w:t>announcement-photos</w:t>
@@ -7400,7 +7199,6 @@
             <w:r>
               <w:rPr>
                 <w:rFonts w:ascii="Consolas" w:hAnsi="Consolas"/>
-                <w:color w:val="B03060"/>
                 <w:sz w:val="20"/>
               </w:rPr>
               <w:t>/announcements</w:t>
@@ -7416,7 +7214,6 @@
             <w:r>
               <w:rPr>
                 <w:rFonts w:ascii="Consolas" w:hAnsi="Consolas"/>
-                <w:color w:val="B03060"/>
                 <w:sz w:val="20"/>
               </w:rPr>
               <w:t>announcements</w:t>
@@ -7448,10 +7245,9 @@
             <w:r>
               <w:rPr>
                 <w:rFonts w:ascii="Consolas" w:hAnsi="Consolas"/>
-                <w:color w:val="B03060"/>
                 <w:sz w:val="20"/>
               </w:rPr>
-              <w:t>residents_with_age</w:t>
+              <w:t>residents</w:t>
             </w:r>
             <w:r>
               <w:t xml:space="preserve"> (R)</w:t>
@@ -7480,7 +7276,6 @@
             <w:r>
               <w:rPr>
                 <w:rFonts w:ascii="Consolas" w:hAnsi="Consolas"/>
-                <w:color w:val="B03060"/>
                 <w:sz w:val="20"/>
               </w:rPr>
               <w:t>population_history</w:t>
@@ -7515,7 +7310,6 @@
             <w:r>
               <w:rPr>
                 <w:rFonts w:ascii="Consolas" w:hAnsi="Consolas"/>
-                <w:color w:val="B03060"/>
                 <w:sz w:val="20"/>
               </w:rPr>
               <w:t>audit_logs</w:t>
@@ -7553,7 +7347,6 @@
             <w:r>
               <w:rPr>
                 <w:rFonts w:ascii="Consolas" w:hAnsi="Consolas"/>
-                <w:color w:val="B03060"/>
                 <w:sz w:val="20"/>
               </w:rPr>
               <w:t>audit_logs</w:t>
@@ -7640,7 +7433,6 @@
             <w:r>
               <w:rPr>
                 <w:rFonts w:ascii="Consolas" w:hAnsi="Consolas"/>
-                <w:color w:val="B03060"/>
                 <w:sz w:val="20"/>
               </w:rPr>
               <w:t>brgy_sec</w:t>
@@ -7672,7 +7464,6 @@
             <w:r>
               <w:rPr>
                 <w:rFonts w:ascii="Consolas" w:hAnsi="Consolas"/>
-                <w:color w:val="B03060"/>
                 <w:sz w:val="20"/>
               </w:rPr>
               <w:t>tanod</w:t>
@@ -7727,7 +7518,6 @@
       <w:r>
         <w:rPr>
           <w:rFonts w:ascii="Consolas" w:hAnsi="Consolas"/>
-          <w:color w:val="B03060"/>
           <w:sz w:val="20"/>
         </w:rPr>
         <w:t>canAccess(role, path)</w:t>

</xml_diff>

<commit_message>
Keep residents.age (used in Add/View Resident)
Reverted the age DROP in trim_unused_columns.sql; re-added age to the ERD
and DATA_MODEL field list and removed it from the removed-columns note.
</commit_message>
<xml_diff>
--- a/docx/DATA_MODEL.docx
+++ b/docx/DATA_MODEL.docx
@@ -444,7 +444,7 @@
           <w:i/>
           <w:sz w:val="20"/>
         </w:rPr>
-        <w:t>residents.age/suffix/educational_attainment/philhealth_no</w:t>
+        <w:t>residents.suffix/educational_attainment/philhealth_no</w:t>
       </w:r>
       <w:r>
         <w:rPr>
@@ -1222,8 +1222,44 @@
           </w:tcPr>
           <w:p>
             <w:r/>
-            <w:r>
-              <w:t>age is computed from this in the app</w:t>
+          </w:p>
+        </w:tc>
+      </w:tr>
+      <w:tr>
+        <w:tc>
+          <w:tcPr>
+            <w:tcW w:type="dxa" w:w="2880"/>
+          </w:tcPr>
+          <w:p>
+            <w:r/>
+            <w:r>
+              <w:rPr>
+                <w:rFonts w:ascii="Consolas" w:hAnsi="Consolas"/>
+                <w:sz w:val="20"/>
+              </w:rPr>
+              <w:t>age</w:t>
+            </w:r>
+          </w:p>
+        </w:tc>
+        <w:tc>
+          <w:tcPr>
+            <w:tcW w:type="dxa" w:w="2880"/>
+          </w:tcPr>
+          <w:p>
+            <w:r/>
+            <w:r>
+              <w:t>int</w:t>
+            </w:r>
+          </w:p>
+        </w:tc>
+        <w:tc>
+          <w:tcPr>
+            <w:tcW w:type="dxa" w:w="2880"/>
+          </w:tcPr>
+          <w:p>
+            <w:r/>
+            <w:r>
+              <w:t>resident's age (also computed from DOB in the app)</w:t>
             </w:r>
           </w:p>
         </w:tc>

</xml_diff>